<commit_message>
feat(ui): complete editorial design, full stylesheet, navigation and ats cv viewer
</commit_message>
<xml_diff>
--- a/public/El_Hassan_Mohamed_CV.docx
+++ b/public/El_Hassan_Mohamed_CV.docx
@@ -116,7 +116,7 @@
                 <w:color w:val="222222"/>
                 <w:sz w:val="22"/>
               </w:rPr>
-              <w:t>Agriculture graduate with professional training in Food Safety and Quality Management Systems. Completed theoretical and practical training in ISO standards (ISO 22000:2018, ISO 50001:2018, ISO 14001), HACCP, PRPs, GMP, and GHP, including system design, hazard analysis, problem-solving, and food safety procedures. Seeking an entry-level opportunity in Quality Assurance, Quality Control, or Food Safety within the food manufacturing industry.</w:t>
+              <w:t>Agriculture graduate specializing in Food Safety and Quality Assurance (QA/QC), equipped with practical expertise in ISO standards (22000:2018, 50001:2018, 14001), HACCP, GMP, and GHP guidelines. Proficient in prerequisite programs (PRPs), biological and chemical risk assessments, standard operating procedures (SOPs), and audit compliance. Seeking an entry-level Quality Assurance, Quality Control, or Food Safety role in food manufacturing.</w:t>
             </w:r>
           </w:p>
         </w:tc>
@@ -331,7 +331,7 @@
                 <w:color w:val="222222"/>
                 <w:sz w:val="21"/>
               </w:rPr>
-              <w:t>Completed theoretical and practical training in food safety and quality management systems (ISO 22000:2018, ISO 50001:2018, ISO 14001, HACCP, PRPs, GMP, and GHP).</w:t>
+              <w:t>Mastered compliance frameworks and auditing principles across ISO 22000:2018, ISO 50001:2018, ISO 14001, PRPs, and Good Manufacturing Practices (GMP/GHP).</w:t>
             </w:r>
           </w:p>
           <w:p>
@@ -353,7 +353,7 @@
                 <w:color w:val="222222"/>
                 <w:sz w:val="21"/>
               </w:rPr>
-              <w:t>Applied food safety concepts through practical projects involving system design, hazard analysis, problem-solving, and food safety procedures.</w:t>
+              <w:t>Evaluated manufacturing workflows through simulated plant scenarios, assessing critical contamination risks and establishing preventive controls to satisfy regulatory food hygiene standards.</w:t>
             </w:r>
           </w:p>
           <w:p>
@@ -438,7 +438,7 @@
                 <w:color w:val="222222"/>
                 <w:sz w:val="21"/>
               </w:rPr>
-              <w:t>Completed practical training in poultry production operations.</w:t>
+              <w:t>Supported daily production workflows, flock monitoring, and housing management in an active commercial poultry facility.</w:t>
             </w:r>
           </w:p>
           <w:p>
@@ -460,7 +460,7 @@
                 <w:color w:val="222222"/>
                 <w:sz w:val="21"/>
               </w:rPr>
-              <w:t>Gained practical exposure to poultry farm management, biosecurity, and production practices.</w:t>
+              <w:t>Implemented strict farm biosecurity protocols, sanitation routines, and disease prevention measures to ensure flock health and biosafety compliance.</w:t>
             </w:r>
           </w:p>
           <w:p>
@@ -661,7 +661,7 @@
                 <w:color w:val="222222"/>
                 <w:sz w:val="21"/>
               </w:rPr>
-              <w:t>Developed communication, time management, and problem-solving skills in a fast-paced work environment.</w:t>
+              <w:t>Handled order tracking and live customer inquiries in a high-volume delivery environment, resolving order discrepancies and delivery exceptions under tight time constraints.</w:t>
             </w:r>
           </w:p>
         </w:tc>
@@ -736,7 +736,7 @@
                 <w:color w:val="222222"/>
                 <w:sz w:val="21"/>
               </w:rPr>
-              <w:t>Participated in practical exercises involving food safety system design.</w:t>
+              <w:t>Engineered a comprehensive Food Safety Plan model for food processing lines, developing operational flowcharts, PRPs, and hazard evaluation matrices.</w:t>
             </w:r>
           </w:p>
           <w:p>
@@ -758,7 +758,7 @@
                 <w:color w:val="222222"/>
                 <w:sz w:val="21"/>
               </w:rPr>
-              <w:t>Practiced identifying potential food safety hazards and determining appropriate control measures.</w:t>
+              <w:t>Identified Critical Control Points (CCPs) across biological, chemical, and physical parameters, establishing strict critical limits and continuous monitoring mechanisms.</w:t>
             </w:r>
           </w:p>
           <w:p>
@@ -780,7 +780,7 @@
                 <w:color w:val="222222"/>
                 <w:sz w:val="21"/>
               </w:rPr>
-              <w:t>Worked on simulated food safety scenarios and problem-solving procedures for food manufacturing operations.</w:t>
+              <w:t>Formulated root-cause investigation workflows and Corrective and Preventive Action (CAPA) protocols to resolve simulated manufacturing nonconformities.</w:t>
             </w:r>
           </w:p>
         </w:tc>
@@ -1212,7 +1212,7 @@
                 <w:color w:val="222222"/>
                 <w:sz w:val="21"/>
               </w:rPr>
-              <w:t>Food Safety Problem-Solving</w:t>
+              <w:t>Root Cause Analysis (RCA) &amp; CAPA Procedures</w:t>
             </w:r>
           </w:p>
           <w:p>

</xml_diff>